<commit_message>
docs(paper): update affiliation to Independent Researcher in Title Page, Cover Letter, and manuscript_with_authors
</commit_message>
<xml_diff>
--- a/paper/Cover_Letter.docx
+++ b/paper/Cover_Letter.docx
@@ -102,9 +102,7 @@
         </w:rPr>
         <w:t>Harsh Pradeepkumar Ambule</w:t>
         <w:br/>
-        <w:t>Department of Artificial Intelligence</w:t>
-        <w:br/>
-        <w:t>Priyadarshini Bhagwati College of Engineering (PBCOE)</w:t>
+        <w:t>Independent Researcher</w:t>
         <w:br/>
         <w:t>Nagpur, Maharashtra 440024, India</w:t>
         <w:br/>

</xml_diff>